<commit_message>
Organize Galascope electrical docs and add Rev F/G MV connection strategy.
Move SLDs, generators, and analysis into electrical/ with CHANGELOG; regenerate Rev D-G drawings; document UniSec as-built, parallel feeder options (G1a/b/c, G2a/b/c), and client PV equipment datasheets.

Co-authored-by: Cursor <cursoragent@cursor.com>
</commit_message>
<xml_diff>
--- a/docs/clients/group-order/Group2_Esperia_Energy/contracts/notes/LCY-ESPERIA-INTERNAL-meeting-prep-20-May-2026.docx
+++ b/docs/clients/group-order/Group2_Esperia_Energy/contracts/notes/LCY-ESPERIA-INTERNAL-meeting-prep-20-May-2026.docx
@@ -427,7 +427,85 @@
           <w:color w:val="C9A432"/>
           <w:sz w:val="28"/>
         </w:rPr>
-        <w:t>10. Suggested talking points for Wednesday</w:t>
+        <w:t>10. Scope &amp; pricing clarifications for Dino (group / Galascope)</w:t>
+      </w:r>
+    </w:p>
+    <w:p>
+      <w:pPr>
+        <w:pStyle w:val="ListBullet"/>
+      </w:pPr>
+      <w:r>
+        <w:rPr>
+          <w:rFonts w:ascii="Calibri" w:hAnsi="Calibri"/>
+          <w:color w:val="000000"/>
+          <w:sz w:val="22"/>
+        </w:rPr>
+        <w:t>Show group-proposal.html scope page: included vs excluded split is now explicit.</w:t>
+      </w:r>
+    </w:p>
+    <w:p>
+      <w:pPr>
+        <w:pStyle w:val="ListBullet"/>
+      </w:pPr>
+      <w:r>
+        <w:rPr>
+          <w:rFonts w:ascii="Calibri" w:hAnsi="Calibri"/>
+          <w:color w:val="000000"/>
+          <w:sz w:val="22"/>
+        </w:rPr>
+        <w:t>INCLUDED in group €/kWh: Costas Hadjikyriacou ETEK installer sign-off (installation compliance, protection settings attestation, EAC liaison for BESS compound); Lighthief coordinates and attends DSO witness; full commissioning.</w:t>
+      </w:r>
+    </w:p>
+    <w:p>
+      <w:pPr>
+        <w:pStyle w:val="ListBullet"/>
+      </w:pPr>
+      <w:r>
+        <w:rPr>
+          <w:rFonts w:ascii="Calibri" w:hAnsi="Calibri"/>
+          <w:color w:val="000000"/>
+          <w:sz w:val="22"/>
+        </w:rPr>
+        <w:t>EXCLUDED: licensed electrical design / permit / as-built drawing packages for the wider site (€5k–15k/site typical — Client's engineer); EAC/DSO inspection and protection-test invoices; external LPS; telecom OPEX.</w:t>
+      </w:r>
+    </w:p>
+    <w:p>
+      <w:pPr>
+        <w:pStyle w:val="ListBullet"/>
+      </w:pPr>
+      <w:r>
+        <w:rPr>
+          <w:rFonts w:ascii="Calibri" w:hAnsi="Calibri"/>
+          <w:color w:val="000000"/>
+          <w:sz w:val="22"/>
+        </w:rPr>
+        <w:t>Key message: installer sign-off ≠ licensed design drawings — confirm Dino understands before signature; mirror in EPC Schedule A.</w:t>
+      </w:r>
+    </w:p>
+    <w:p>
+      <w:pPr>
+        <w:pStyle w:val="ListBullet"/>
+      </w:pPr>
+      <w:r>
+        <w:rPr>
+          <w:rFonts w:ascii="Calibri" w:hAnsi="Calibri"/>
+          <w:color w:val="000000"/>
+          <w:sz w:val="22"/>
+        </w:rPr>
+        <w:t>See meeting-dino-terms-may2026.md for verbatim talking lines.</w:t>
+      </w:r>
+    </w:p>
+    <w:p>
+      <w:pPr>
+        <w:spacing w:after="120"/>
+      </w:pPr>
+      <w:r>
+        <w:rPr>
+          <w:b/>
+          <w:color w:val="C9A432"/>
+          <w:sz w:val="28"/>
+        </w:rPr>
+        <w:t>11. Suggested talking points — commercial / legal</w:t>
       </w:r>
     </w:p>
     <w:p>

</xml_diff>